<commit_message>
docs: finalize v2.4.0 document navigation
</commit_message>
<xml_diff>
--- a/documents/DeskSideClock_ソフトウェア仕様書_v2.4.0.docx
+++ b/documents/DeskSideClock_ソフトウェア仕様書_v2.4.0.docx
@@ -357,6 +357,7 @@
       <w:pPr>
         <w:pStyle w:val="Heading1"/>
         <w:keepNext/>
+        <w:pageBreakBefore/>
       </w:pPr>
       <w:r>
         <w:t>目次</w:t>
@@ -364,208 +365,1594 @@
     </w:p>
     <w:p>
       <w:pPr>
-        <w:spacing w:after="40"/>
+        <w:pStyle w:val="TOC1"/>
+        <w:tabs>
+          <w:tab w:val="right" w:leader="dot" w:pos="9810"/>
+        </w:tabs>
+        <w:rPr>
+          <w:rFonts w:asciiTheme="minorHAnsi" w:eastAsiaTheme="minorEastAsia" w:hAnsiTheme="minorHAnsi"/>
+          <w:noProof/>
+          <w:kern w:val="2"/>
+          <w:sz w:val="21"/>
+          <w:szCs w:val="24"/>
+          <w:lang w:eastAsia="ja-JP"/>
+          <w14:ligatures w14:val="standardContextual"/>
+        </w:rPr>
       </w:pPr>
       <w:r>
-        <w:rPr>
-          <w:rFonts w:ascii="Arial" w:hAnsi="Arial" w:eastAsia="Noto Sans JP"/>
-          <w:b/>
-          <w:color w:val="1F4E78"/>
-          <w:sz w:val="20"/>
-        </w:rPr>
-        <w:t>1  文書概要</w:t>
+        <w:fldChar w:fldCharType="begin"/>
       </w:r>
+      <w:r>
+        <w:instrText xml:space="preserve"> TOC \o "1-3" \h \u </w:instrText>
+      </w:r>
+      <w:r>
+        <w:fldChar w:fldCharType="separate"/>
+      </w:r>
+      <w:hyperlink w:anchor="_Toc238979284" w:history="1">
+        <w:r>
+          <w:rPr>
+            <w:rStyle w:val="aff"/>
+            <w:noProof/>
+          </w:rPr>
+          <w:t xml:space="preserve">1. </w:t>
+        </w:r>
+        <w:r>
+          <w:rPr>
+            <w:rStyle w:val="aff"/>
+            <w:noProof/>
+          </w:rPr>
+          <w:t>文書概要</w:t>
+        </w:r>
+        <w:r>
+          <w:rPr>
+            <w:noProof/>
+          </w:rPr>
+          <w:tab/>
+        </w:r>
+        <w:r>
+          <w:rPr>
+            <w:noProof/>
+          </w:rPr>
+          <w:fldChar w:fldCharType="begin"/>
+        </w:r>
+        <w:r>
+          <w:rPr>
+            <w:noProof/>
+          </w:rPr>
+          <w:instrText xml:space="preserve"> PAGEREF _Toc238979284 \h </w:instrText>
+        </w:r>
+        <w:r>
+          <w:rPr>
+            <w:noProof/>
+          </w:rPr>
+        </w:r>
+        <w:r>
+          <w:rPr>
+            <w:noProof/>
+          </w:rPr>
+          <w:fldChar w:fldCharType="separate"/>
+        </w:r>
+        <w:r>
+          <w:rPr>
+            <w:noProof/>
+          </w:rPr>
+          <w:t>3</w:t>
+        </w:r>
+        <w:r>
+          <w:rPr>
+            <w:noProof/>
+          </w:rPr>
+          <w:fldChar w:fldCharType="end"/>
+        </w:r>
+      </w:hyperlink>
     </w:p>
     <w:p>
       <w:pPr>
-        <w:spacing w:after="40"/>
+        <w:pStyle w:val="TOC2"/>
+        <w:tabs>
+          <w:tab w:val="right" w:leader="dot" w:pos="9810"/>
+        </w:tabs>
+        <w:rPr>
+          <w:rFonts w:asciiTheme="minorHAnsi" w:eastAsiaTheme="minorEastAsia" w:hAnsiTheme="minorHAnsi"/>
+          <w:noProof/>
+          <w:kern w:val="2"/>
+          <w:sz w:val="21"/>
+          <w:szCs w:val="24"/>
+          <w:lang w:eastAsia="ja-JP"/>
+          <w14:ligatures w14:val="standardContextual"/>
+        </w:rPr>
       </w:pPr>
-      <w:r>
-        <w:rPr>
-          <w:rFonts w:ascii="Arial" w:hAnsi="Arial" w:eastAsia="Noto Sans JP"/>
-          <w:b/>
-          <w:color w:val="1F4E78"/>
-          <w:sz w:val="20"/>
-        </w:rPr>
-        <w:t>2  システム概要</w:t>
-      </w:r>
+      <w:hyperlink w:anchor="_Toc238979285" w:history="1">
+        <w:r>
+          <w:rPr>
+            <w:rStyle w:val="aff"/>
+            <w:noProof/>
+          </w:rPr>
+          <w:t xml:space="preserve">1.1 </w:t>
+        </w:r>
+        <w:r>
+          <w:rPr>
+            <w:rStyle w:val="aff"/>
+            <w:noProof/>
+          </w:rPr>
+          <w:t>目的</w:t>
+        </w:r>
+        <w:r>
+          <w:rPr>
+            <w:noProof/>
+          </w:rPr>
+          <w:tab/>
+        </w:r>
+        <w:r>
+          <w:rPr>
+            <w:noProof/>
+          </w:rPr>
+          <w:fldChar w:fldCharType="begin"/>
+        </w:r>
+        <w:r>
+          <w:rPr>
+            <w:noProof/>
+          </w:rPr>
+          <w:instrText xml:space="preserve"> PAGEREF _Toc238979285 \h </w:instrText>
+        </w:r>
+        <w:r>
+          <w:rPr>
+            <w:noProof/>
+          </w:rPr>
+        </w:r>
+        <w:r>
+          <w:rPr>
+            <w:noProof/>
+          </w:rPr>
+          <w:fldChar w:fldCharType="separate"/>
+        </w:r>
+        <w:r>
+          <w:rPr>
+            <w:noProof/>
+          </w:rPr>
+          <w:t>3</w:t>
+        </w:r>
+        <w:r>
+          <w:rPr>
+            <w:noProof/>
+          </w:rPr>
+          <w:fldChar w:fldCharType="end"/>
+        </w:r>
+      </w:hyperlink>
     </w:p>
     <w:p>
       <w:pPr>
-        <w:spacing w:after="40"/>
+        <w:pStyle w:val="TOC2"/>
+        <w:tabs>
+          <w:tab w:val="right" w:leader="dot" w:pos="9810"/>
+        </w:tabs>
+        <w:rPr>
+          <w:rFonts w:asciiTheme="minorHAnsi" w:eastAsiaTheme="minorEastAsia" w:hAnsiTheme="minorHAnsi"/>
+          <w:noProof/>
+          <w:kern w:val="2"/>
+          <w:sz w:val="21"/>
+          <w:szCs w:val="24"/>
+          <w:lang w:eastAsia="ja-JP"/>
+          <w14:ligatures w14:val="standardContextual"/>
+        </w:rPr>
       </w:pPr>
-      <w:r>
-        <w:rPr>
-          <w:rFonts w:ascii="Arial" w:hAnsi="Arial" w:eastAsia="Noto Sans JP"/>
-          <w:b/>
-          <w:color w:val="1F4E78"/>
-          <w:sz w:val="20"/>
-        </w:rPr>
-        <w:t>3  動作環境</w:t>
-      </w:r>
+      <w:hyperlink w:anchor="_Toc238979286" w:history="1">
+        <w:r>
+          <w:rPr>
+            <w:rStyle w:val="aff"/>
+            <w:noProof/>
+          </w:rPr>
+          <w:t xml:space="preserve">1.2 </w:t>
+        </w:r>
+        <w:r>
+          <w:rPr>
+            <w:rStyle w:val="aff"/>
+            <w:noProof/>
+          </w:rPr>
+          <w:t>対象範囲</w:t>
+        </w:r>
+        <w:r>
+          <w:rPr>
+            <w:noProof/>
+          </w:rPr>
+          <w:tab/>
+        </w:r>
+        <w:r>
+          <w:rPr>
+            <w:noProof/>
+          </w:rPr>
+          <w:fldChar w:fldCharType="begin"/>
+        </w:r>
+        <w:r>
+          <w:rPr>
+            <w:noProof/>
+          </w:rPr>
+          <w:instrText xml:space="preserve"> PAGEREF _Toc238979286 \h </w:instrText>
+        </w:r>
+        <w:r>
+          <w:rPr>
+            <w:noProof/>
+          </w:rPr>
+        </w:r>
+        <w:r>
+          <w:rPr>
+            <w:noProof/>
+          </w:rPr>
+          <w:fldChar w:fldCharType="separate"/>
+        </w:r>
+        <w:r>
+          <w:rPr>
+            <w:noProof/>
+          </w:rPr>
+          <w:t>3</w:t>
+        </w:r>
+        <w:r>
+          <w:rPr>
+            <w:noProof/>
+          </w:rPr>
+          <w:fldChar w:fldCharType="end"/>
+        </w:r>
+      </w:hyperlink>
     </w:p>
     <w:p>
       <w:pPr>
-        <w:spacing w:after="40"/>
+        <w:pStyle w:val="TOC1"/>
+        <w:tabs>
+          <w:tab w:val="right" w:leader="dot" w:pos="9810"/>
+        </w:tabs>
+        <w:rPr>
+          <w:rFonts w:asciiTheme="minorHAnsi" w:eastAsiaTheme="minorEastAsia" w:hAnsiTheme="minorHAnsi"/>
+          <w:noProof/>
+          <w:kern w:val="2"/>
+          <w:sz w:val="21"/>
+          <w:szCs w:val="24"/>
+          <w:lang w:eastAsia="ja-JP"/>
+          <w14:ligatures w14:val="standardContextual"/>
+        </w:rPr>
       </w:pPr>
-      <w:r>
-        <w:rPr>
-          <w:rFonts w:ascii="Arial" w:hAnsi="Arial" w:eastAsia="Noto Sans JP"/>
-          <w:b/>
-          <w:color w:val="1F4E78"/>
-          <w:sz w:val="20"/>
-        </w:rPr>
-        <w:t>4  機能仕様</w:t>
-      </w:r>
+      <w:hyperlink w:anchor="_Toc238979287" w:history="1">
+        <w:r>
+          <w:rPr>
+            <w:rStyle w:val="aff"/>
+            <w:noProof/>
+          </w:rPr>
+          <w:t xml:space="preserve">2. </w:t>
+        </w:r>
+        <w:r>
+          <w:rPr>
+            <w:rStyle w:val="aff"/>
+            <w:noProof/>
+          </w:rPr>
+          <w:t>システム概要</w:t>
+        </w:r>
+        <w:r>
+          <w:rPr>
+            <w:noProof/>
+          </w:rPr>
+          <w:tab/>
+        </w:r>
+        <w:r>
+          <w:rPr>
+            <w:noProof/>
+          </w:rPr>
+          <w:fldChar w:fldCharType="begin"/>
+        </w:r>
+        <w:r>
+          <w:rPr>
+            <w:noProof/>
+          </w:rPr>
+          <w:instrText xml:space="preserve"> PAGEREF _Toc238979287 \h </w:instrText>
+        </w:r>
+        <w:r>
+          <w:rPr>
+            <w:noProof/>
+          </w:rPr>
+        </w:r>
+        <w:r>
+          <w:rPr>
+            <w:noProof/>
+          </w:rPr>
+          <w:fldChar w:fldCharType="separate"/>
+        </w:r>
+        <w:r>
+          <w:rPr>
+            <w:noProof/>
+          </w:rPr>
+          <w:t>3</w:t>
+        </w:r>
+        <w:r>
+          <w:rPr>
+            <w:noProof/>
+          </w:rPr>
+          <w:fldChar w:fldCharType="end"/>
+        </w:r>
+      </w:hyperlink>
     </w:p>
     <w:p>
       <w:pPr>
-        <w:spacing w:after="40"/>
+        <w:pStyle w:val="TOC1"/>
+        <w:tabs>
+          <w:tab w:val="right" w:leader="dot" w:pos="9810"/>
+        </w:tabs>
+        <w:rPr>
+          <w:rFonts w:asciiTheme="minorHAnsi" w:eastAsiaTheme="minorEastAsia" w:hAnsiTheme="minorHAnsi"/>
+          <w:noProof/>
+          <w:kern w:val="2"/>
+          <w:sz w:val="21"/>
+          <w:szCs w:val="24"/>
+          <w:lang w:eastAsia="ja-JP"/>
+          <w14:ligatures w14:val="standardContextual"/>
+        </w:rPr>
       </w:pPr>
-      <w:r>
-        <w:rPr>
-          <w:rFonts w:ascii="Arial" w:hAnsi="Arial" w:eastAsia="Noto Sans JP"/>
-          <w:b/>
-          <w:color w:val="1F4E78"/>
-          <w:sz w:val="20"/>
-        </w:rPr>
-        <w:t>5  画面・操作仕様</w:t>
-      </w:r>
+      <w:hyperlink w:anchor="_Toc238979288" w:history="1">
+        <w:r>
+          <w:rPr>
+            <w:rStyle w:val="aff"/>
+            <w:noProof/>
+          </w:rPr>
+          <w:t xml:space="preserve">3. </w:t>
+        </w:r>
+        <w:r>
+          <w:rPr>
+            <w:rStyle w:val="aff"/>
+            <w:noProof/>
+          </w:rPr>
+          <w:t>動作環境</w:t>
+        </w:r>
+        <w:r>
+          <w:rPr>
+            <w:noProof/>
+          </w:rPr>
+          <w:tab/>
+        </w:r>
+        <w:r>
+          <w:rPr>
+            <w:noProof/>
+          </w:rPr>
+          <w:fldChar w:fldCharType="begin"/>
+        </w:r>
+        <w:r>
+          <w:rPr>
+            <w:noProof/>
+          </w:rPr>
+          <w:instrText xml:space="preserve"> PAGEREF _Toc238979288 \h </w:instrText>
+        </w:r>
+        <w:r>
+          <w:rPr>
+            <w:noProof/>
+          </w:rPr>
+        </w:r>
+        <w:r>
+          <w:rPr>
+            <w:noProof/>
+          </w:rPr>
+          <w:fldChar w:fldCharType="separate"/>
+        </w:r>
+        <w:r>
+          <w:rPr>
+            <w:noProof/>
+          </w:rPr>
+          <w:t>3</w:t>
+        </w:r>
+        <w:r>
+          <w:rPr>
+            <w:noProof/>
+          </w:rPr>
+          <w:fldChar w:fldCharType="end"/>
+        </w:r>
+      </w:hyperlink>
     </w:p>
     <w:p>
       <w:pPr>
-        <w:spacing w:after="40"/>
+        <w:pStyle w:val="TOC1"/>
+        <w:tabs>
+          <w:tab w:val="right" w:leader="dot" w:pos="9810"/>
+        </w:tabs>
+        <w:rPr>
+          <w:rFonts w:asciiTheme="minorHAnsi" w:eastAsiaTheme="minorEastAsia" w:hAnsiTheme="minorHAnsi"/>
+          <w:noProof/>
+          <w:kern w:val="2"/>
+          <w:sz w:val="21"/>
+          <w:szCs w:val="24"/>
+          <w:lang w:eastAsia="ja-JP"/>
+          <w14:ligatures w14:val="standardContextual"/>
+        </w:rPr>
       </w:pPr>
-      <w:r>
-        <w:rPr>
-          <w:rFonts w:ascii="Arial" w:hAnsi="Arial" w:eastAsia="Noto Sans JP"/>
-          <w:b/>
-          <w:color w:val="1F4E78"/>
-          <w:sz w:val="20"/>
-        </w:rPr>
-        <w:t>6  データ取得・表示仕様</w:t>
-      </w:r>
+      <w:hyperlink w:anchor="_Toc238979289" w:history="1">
+        <w:r>
+          <w:rPr>
+            <w:rStyle w:val="aff"/>
+            <w:noProof/>
+          </w:rPr>
+          <w:t xml:space="preserve">4. </w:t>
+        </w:r>
+        <w:r>
+          <w:rPr>
+            <w:rStyle w:val="aff"/>
+            <w:noProof/>
+          </w:rPr>
+          <w:t>機能仕様</w:t>
+        </w:r>
+        <w:r>
+          <w:rPr>
+            <w:noProof/>
+          </w:rPr>
+          <w:tab/>
+        </w:r>
+        <w:r>
+          <w:rPr>
+            <w:noProof/>
+          </w:rPr>
+          <w:fldChar w:fldCharType="begin"/>
+        </w:r>
+        <w:r>
+          <w:rPr>
+            <w:noProof/>
+          </w:rPr>
+          <w:instrText xml:space="preserve"> PAGEREF _Toc238979289 \h </w:instrText>
+        </w:r>
+        <w:r>
+          <w:rPr>
+            <w:noProof/>
+          </w:rPr>
+        </w:r>
+        <w:r>
+          <w:rPr>
+            <w:noProof/>
+          </w:rPr>
+          <w:fldChar w:fldCharType="separate"/>
+        </w:r>
+        <w:r>
+          <w:rPr>
+            <w:noProof/>
+          </w:rPr>
+          <w:t>4</w:t>
+        </w:r>
+        <w:r>
+          <w:rPr>
+            <w:noProof/>
+          </w:rPr>
+          <w:fldChar w:fldCharType="end"/>
+        </w:r>
+      </w:hyperlink>
     </w:p>
     <w:p>
       <w:pPr>
-        <w:spacing w:after="40"/>
+        <w:pStyle w:val="TOC1"/>
+        <w:tabs>
+          <w:tab w:val="right" w:leader="dot" w:pos="9810"/>
+        </w:tabs>
+        <w:rPr>
+          <w:rFonts w:asciiTheme="minorHAnsi" w:eastAsiaTheme="minorEastAsia" w:hAnsiTheme="minorHAnsi"/>
+          <w:noProof/>
+          <w:kern w:val="2"/>
+          <w:sz w:val="21"/>
+          <w:szCs w:val="24"/>
+          <w:lang w:eastAsia="ja-JP"/>
+          <w14:ligatures w14:val="standardContextual"/>
+        </w:rPr>
       </w:pPr>
-      <w:r>
-        <w:rPr>
-          <w:rFonts w:ascii="Arial" w:hAnsi="Arial" w:eastAsia="Noto Sans JP"/>
-          <w:b/>
-          <w:color w:val="1F4E78"/>
-          <w:sz w:val="20"/>
-        </w:rPr>
-        <w:t>7  表示形式・単位</w:t>
-      </w:r>
+      <w:hyperlink w:anchor="_Toc238979290" w:history="1">
+        <w:r>
+          <w:rPr>
+            <w:rStyle w:val="aff"/>
+            <w:noProof/>
+          </w:rPr>
+          <w:t xml:space="preserve">5. </w:t>
+        </w:r>
+        <w:r>
+          <w:rPr>
+            <w:rStyle w:val="aff"/>
+            <w:noProof/>
+          </w:rPr>
+          <w:t>画面・操作仕様</w:t>
+        </w:r>
+        <w:r>
+          <w:rPr>
+            <w:noProof/>
+          </w:rPr>
+          <w:tab/>
+        </w:r>
+        <w:r>
+          <w:rPr>
+            <w:noProof/>
+          </w:rPr>
+          <w:fldChar w:fldCharType="begin"/>
+        </w:r>
+        <w:r>
+          <w:rPr>
+            <w:noProof/>
+          </w:rPr>
+          <w:instrText xml:space="preserve"> PAGEREF _Toc238979290 \h </w:instrText>
+        </w:r>
+        <w:r>
+          <w:rPr>
+            <w:noProof/>
+          </w:rPr>
+        </w:r>
+        <w:r>
+          <w:rPr>
+            <w:noProof/>
+          </w:rPr>
+          <w:fldChar w:fldCharType="separate"/>
+        </w:r>
+        <w:r>
+          <w:rPr>
+            <w:noProof/>
+          </w:rPr>
+          <w:t>5</w:t>
+        </w:r>
+        <w:r>
+          <w:rPr>
+            <w:noProof/>
+          </w:rPr>
+          <w:fldChar w:fldCharType="end"/>
+        </w:r>
+      </w:hyperlink>
     </w:p>
     <w:p>
       <w:pPr>
-        <w:spacing w:after="40"/>
+        <w:pStyle w:val="TOC2"/>
+        <w:tabs>
+          <w:tab w:val="right" w:leader="dot" w:pos="9810"/>
+        </w:tabs>
+        <w:rPr>
+          <w:rFonts w:asciiTheme="minorHAnsi" w:eastAsiaTheme="minorEastAsia" w:hAnsiTheme="minorHAnsi"/>
+          <w:noProof/>
+          <w:kern w:val="2"/>
+          <w:sz w:val="21"/>
+          <w:szCs w:val="24"/>
+          <w:lang w:eastAsia="ja-JP"/>
+          <w14:ligatures w14:val="standardContextual"/>
+        </w:rPr>
       </w:pPr>
-      <w:r>
-        <w:rPr>
-          <w:rFonts w:ascii="Arial" w:hAnsi="Arial" w:eastAsia="Noto Sans JP"/>
-          <w:b/>
-          <w:color w:val="1F4E78"/>
-          <w:sz w:val="20"/>
-        </w:rPr>
-        <w:t>8  異常時・フォールバック仕様</w:t>
-      </w:r>
+      <w:hyperlink w:anchor="_Toc238979291" w:history="1">
+        <w:r>
+          <w:rPr>
+            <w:rStyle w:val="aff"/>
+            <w:noProof/>
+          </w:rPr>
+          <w:t xml:space="preserve">5.1 </w:t>
+        </w:r>
+        <w:r>
+          <w:rPr>
+            <w:rStyle w:val="aff"/>
+            <w:noProof/>
+          </w:rPr>
+          <w:t>通常画面構成</w:t>
+        </w:r>
+        <w:r>
+          <w:rPr>
+            <w:noProof/>
+          </w:rPr>
+          <w:tab/>
+        </w:r>
+        <w:r>
+          <w:rPr>
+            <w:noProof/>
+          </w:rPr>
+          <w:fldChar w:fldCharType="begin"/>
+        </w:r>
+        <w:r>
+          <w:rPr>
+            <w:noProof/>
+          </w:rPr>
+          <w:instrText xml:space="preserve"> PAGEREF _Toc238979291 \h </w:instrText>
+        </w:r>
+        <w:r>
+          <w:rPr>
+            <w:noProof/>
+          </w:rPr>
+        </w:r>
+        <w:r>
+          <w:rPr>
+            <w:noProof/>
+          </w:rPr>
+          <w:fldChar w:fldCharType="separate"/>
+        </w:r>
+        <w:r>
+          <w:rPr>
+            <w:noProof/>
+          </w:rPr>
+          <w:t>5</w:t>
+        </w:r>
+        <w:r>
+          <w:rPr>
+            <w:noProof/>
+          </w:rPr>
+          <w:fldChar w:fldCharType="end"/>
+        </w:r>
+      </w:hyperlink>
     </w:p>
     <w:p>
       <w:pPr>
-        <w:spacing w:after="40"/>
+        <w:pStyle w:val="TOC2"/>
+        <w:tabs>
+          <w:tab w:val="right" w:leader="dot" w:pos="9810"/>
+        </w:tabs>
+        <w:rPr>
+          <w:rFonts w:asciiTheme="minorHAnsi" w:eastAsiaTheme="minorEastAsia" w:hAnsiTheme="minorHAnsi"/>
+          <w:noProof/>
+          <w:kern w:val="2"/>
+          <w:sz w:val="21"/>
+          <w:szCs w:val="24"/>
+          <w:lang w:eastAsia="ja-JP"/>
+          <w14:ligatures w14:val="standardContextual"/>
+        </w:rPr>
       </w:pPr>
-      <w:r>
-        <w:rPr>
-          <w:rFonts w:ascii="Arial" w:hAnsi="Arial" w:eastAsia="Noto Sans JP"/>
-          <w:b/>
-          <w:color w:val="1F4E78"/>
-          <w:sz w:val="20"/>
-        </w:rPr>
-        <w:t>9  設定・永続化仕様</w:t>
-      </w:r>
+      <w:hyperlink w:anchor="_Toc238979292" w:history="1">
+        <w:r>
+          <w:rPr>
+            <w:rStyle w:val="aff"/>
+            <w:noProof/>
+          </w:rPr>
+          <w:t xml:space="preserve">5.2 </w:t>
+        </w:r>
+        <w:r>
+          <w:rPr>
+            <w:rStyle w:val="aff"/>
+            <w:noProof/>
+          </w:rPr>
+          <w:t>タッチ判定</w:t>
+        </w:r>
+        <w:r>
+          <w:rPr>
+            <w:noProof/>
+          </w:rPr>
+          <w:tab/>
+        </w:r>
+        <w:r>
+          <w:rPr>
+            <w:noProof/>
+          </w:rPr>
+          <w:fldChar w:fldCharType="begin"/>
+        </w:r>
+        <w:r>
+          <w:rPr>
+            <w:noProof/>
+          </w:rPr>
+          <w:instrText xml:space="preserve"> PAGEREF _Toc238979292 \h </w:instrText>
+        </w:r>
+        <w:r>
+          <w:rPr>
+            <w:noProof/>
+          </w:rPr>
+        </w:r>
+        <w:r>
+          <w:rPr>
+            <w:noProof/>
+          </w:rPr>
+          <w:fldChar w:fldCharType="separate"/>
+        </w:r>
+        <w:r>
+          <w:rPr>
+            <w:noProof/>
+          </w:rPr>
+          <w:t>5</w:t>
+        </w:r>
+        <w:r>
+          <w:rPr>
+            <w:noProof/>
+          </w:rPr>
+          <w:fldChar w:fldCharType="end"/>
+        </w:r>
+      </w:hyperlink>
     </w:p>
     <w:p>
       <w:pPr>
-        <w:spacing w:after="40"/>
+        <w:pStyle w:val="TOC2"/>
+        <w:tabs>
+          <w:tab w:val="right" w:leader="dot" w:pos="9810"/>
+        </w:tabs>
+        <w:rPr>
+          <w:rFonts w:asciiTheme="minorHAnsi" w:eastAsiaTheme="minorEastAsia" w:hAnsiTheme="minorHAnsi"/>
+          <w:noProof/>
+          <w:kern w:val="2"/>
+          <w:sz w:val="21"/>
+          <w:szCs w:val="24"/>
+          <w:lang w:eastAsia="ja-JP"/>
+          <w14:ligatures w14:val="standardContextual"/>
+        </w:rPr>
       </w:pPr>
-      <w:r>
-        <w:rPr>
-          <w:rFonts w:ascii="Arial" w:hAnsi="Arial" w:eastAsia="Noto Sans JP"/>
-          <w:b/>
-          <w:color w:val="1F4E78"/>
-          <w:sz w:val="20"/>
-        </w:rPr>
-        <w:t>10  非機能仕様</w:t>
-      </w:r>
+      <w:hyperlink w:anchor="_Toc238979293" w:history="1">
+        <w:r>
+          <w:rPr>
+            <w:rStyle w:val="aff"/>
+            <w:noProof/>
+          </w:rPr>
+          <w:t xml:space="preserve">5.3 </w:t>
+        </w:r>
+        <w:r>
+          <w:rPr>
+            <w:rStyle w:val="aff"/>
+            <w:noProof/>
+          </w:rPr>
+          <w:t>レイアウト安定性</w:t>
+        </w:r>
+        <w:r>
+          <w:rPr>
+            <w:noProof/>
+          </w:rPr>
+          <w:tab/>
+        </w:r>
+        <w:r>
+          <w:rPr>
+            <w:noProof/>
+          </w:rPr>
+          <w:fldChar w:fldCharType="begin"/>
+        </w:r>
+        <w:r>
+          <w:rPr>
+            <w:noProof/>
+          </w:rPr>
+          <w:instrText xml:space="preserve"> PAGEREF _Toc238979293 \h </w:instrText>
+        </w:r>
+        <w:r>
+          <w:rPr>
+            <w:noProof/>
+          </w:rPr>
+        </w:r>
+        <w:r>
+          <w:rPr>
+            <w:noProof/>
+          </w:rPr>
+          <w:fldChar w:fldCharType="separate"/>
+        </w:r>
+        <w:r>
+          <w:rPr>
+            <w:noProof/>
+          </w:rPr>
+          <w:t>5</w:t>
+        </w:r>
+        <w:r>
+          <w:rPr>
+            <w:noProof/>
+          </w:rPr>
+          <w:fldChar w:fldCharType="end"/>
+        </w:r>
+      </w:hyperlink>
     </w:p>
     <w:p>
       <w:pPr>
-        <w:spacing w:after="40"/>
+        <w:pStyle w:val="TOC1"/>
+        <w:tabs>
+          <w:tab w:val="right" w:leader="dot" w:pos="9810"/>
+        </w:tabs>
+        <w:rPr>
+          <w:rFonts w:asciiTheme="minorHAnsi" w:eastAsiaTheme="minorEastAsia" w:hAnsiTheme="minorHAnsi"/>
+          <w:noProof/>
+          <w:kern w:val="2"/>
+          <w:sz w:val="21"/>
+          <w:szCs w:val="24"/>
+          <w:lang w:eastAsia="ja-JP"/>
+          <w14:ligatures w14:val="standardContextual"/>
+        </w:rPr>
       </w:pPr>
-      <w:r>
-        <w:rPr>
-          <w:rFonts w:ascii="Arial" w:hAnsi="Arial" w:eastAsia="Noto Sans JP"/>
-          <w:b/>
-          <w:color w:val="1F4E78"/>
-          <w:sz w:val="20"/>
-        </w:rPr>
-        <w:t>11  受入確認項目</w:t>
-      </w:r>
+      <w:hyperlink w:anchor="_Toc238979294" w:history="1">
+        <w:r>
+          <w:rPr>
+            <w:rStyle w:val="aff"/>
+            <w:noProof/>
+          </w:rPr>
+          <w:t xml:space="preserve">6. </w:t>
+        </w:r>
+        <w:r>
+          <w:rPr>
+            <w:rStyle w:val="aff"/>
+            <w:noProof/>
+          </w:rPr>
+          <w:t>データ取得・表示仕様</w:t>
+        </w:r>
+        <w:r>
+          <w:rPr>
+            <w:noProof/>
+          </w:rPr>
+          <w:tab/>
+        </w:r>
+        <w:r>
+          <w:rPr>
+            <w:noProof/>
+          </w:rPr>
+          <w:fldChar w:fldCharType="begin"/>
+        </w:r>
+        <w:r>
+          <w:rPr>
+            <w:noProof/>
+          </w:rPr>
+          <w:instrText xml:space="preserve"> PAGEREF _Toc238979294 \h </w:instrText>
+        </w:r>
+        <w:r>
+          <w:rPr>
+            <w:noProof/>
+          </w:rPr>
+        </w:r>
+        <w:r>
+          <w:rPr>
+            <w:noProof/>
+          </w:rPr>
+          <w:fldChar w:fldCharType="separate"/>
+        </w:r>
+        <w:r>
+          <w:rPr>
+            <w:noProof/>
+          </w:rPr>
+          <w:t>6</w:t>
+        </w:r>
+        <w:r>
+          <w:rPr>
+            <w:noProof/>
+          </w:rPr>
+          <w:fldChar w:fldCharType="end"/>
+        </w:r>
+      </w:hyperlink>
     </w:p>
     <w:p>
       <w:pPr>
-        <w:spacing w:after="40"/>
+        <w:pStyle w:val="TOC2"/>
+        <w:tabs>
+          <w:tab w:val="right" w:leader="dot" w:pos="9810"/>
+        </w:tabs>
+        <w:rPr>
+          <w:rFonts w:asciiTheme="minorHAnsi" w:eastAsiaTheme="minorEastAsia" w:hAnsiTheme="minorHAnsi"/>
+          <w:noProof/>
+          <w:kern w:val="2"/>
+          <w:sz w:val="21"/>
+          <w:szCs w:val="24"/>
+          <w:lang w:eastAsia="ja-JP"/>
+          <w14:ligatures w14:val="standardContextual"/>
+        </w:rPr>
       </w:pPr>
-      <w:r>
-        <w:rPr>
-          <w:rFonts w:ascii="Arial" w:hAnsi="Arial" w:eastAsia="Noto Sans JP"/>
-          <w:b/>
-          <w:color w:val="1F4E78"/>
-          <w:sz w:val="20"/>
-        </w:rPr>
-        <w:t>12  既知の制約</w:t>
-      </w:r>
+      <w:hyperlink w:anchor="_Toc238979295" w:history="1">
+        <w:r>
+          <w:rPr>
+            <w:rStyle w:val="aff"/>
+            <w:noProof/>
+          </w:rPr>
+          <w:t xml:space="preserve">6.1 </w:t>
+        </w:r>
+        <w:r>
+          <w:rPr>
+            <w:rStyle w:val="aff"/>
+            <w:noProof/>
+          </w:rPr>
+          <w:t>情報源選択</w:t>
+        </w:r>
+        <w:r>
+          <w:rPr>
+            <w:noProof/>
+          </w:rPr>
+          <w:tab/>
+        </w:r>
+        <w:r>
+          <w:rPr>
+            <w:noProof/>
+          </w:rPr>
+          <w:fldChar w:fldCharType="begin"/>
+        </w:r>
+        <w:r>
+          <w:rPr>
+            <w:noProof/>
+          </w:rPr>
+          <w:instrText xml:space="preserve"> PAGEREF _Toc238979295 \h </w:instrText>
+        </w:r>
+        <w:r>
+          <w:rPr>
+            <w:noProof/>
+          </w:rPr>
+        </w:r>
+        <w:r>
+          <w:rPr>
+            <w:noProof/>
+          </w:rPr>
+          <w:fldChar w:fldCharType="separate"/>
+        </w:r>
+        <w:r>
+          <w:rPr>
+            <w:noProof/>
+          </w:rPr>
+          <w:t>6</w:t>
+        </w:r>
+        <w:r>
+          <w:rPr>
+            <w:noProof/>
+          </w:rPr>
+          <w:fldChar w:fldCharType="end"/>
+        </w:r>
+      </w:hyperlink>
     </w:p>
     <w:p>
       <w:pPr>
-        <w:spacing w:after="40"/>
+        <w:pStyle w:val="TOC1"/>
+        <w:tabs>
+          <w:tab w:val="right" w:leader="dot" w:pos="9810"/>
+        </w:tabs>
+        <w:rPr>
+          <w:rFonts w:asciiTheme="minorHAnsi" w:eastAsiaTheme="minorEastAsia" w:hAnsiTheme="minorHAnsi"/>
+          <w:noProof/>
+          <w:kern w:val="2"/>
+          <w:sz w:val="21"/>
+          <w:szCs w:val="24"/>
+          <w:lang w:eastAsia="ja-JP"/>
+          <w14:ligatures w14:val="standardContextual"/>
+        </w:rPr>
       </w:pPr>
-      <w:r>
+      <w:hyperlink w:anchor="_Toc238979296" w:history="1">
+        <w:r>
+          <w:rPr>
+            <w:rStyle w:val="aff"/>
+            <w:noProof/>
+          </w:rPr>
+          <w:t xml:space="preserve">7. </w:t>
+        </w:r>
+        <w:r>
+          <w:rPr>
+            <w:rStyle w:val="aff"/>
+            <w:noProof/>
+          </w:rPr>
+          <w:t>表示形式・単位</w:t>
+        </w:r>
+        <w:r>
+          <w:rPr>
+            <w:noProof/>
+          </w:rPr>
+          <w:tab/>
+        </w:r>
+        <w:r>
+          <w:rPr>
+            <w:noProof/>
+          </w:rPr>
+          <w:fldChar w:fldCharType="begin"/>
+        </w:r>
+        <w:r>
+          <w:rPr>
+            <w:noProof/>
+          </w:rPr>
+          <w:instrText xml:space="preserve"> PAGEREF _Toc238979296 \h </w:instrText>
+        </w:r>
+        <w:r>
+          <w:rPr>
+            <w:noProof/>
+          </w:rPr>
+        </w:r>
+        <w:r>
+          <w:rPr>
+            <w:noProof/>
+          </w:rPr>
+          <w:fldChar w:fldCharType="separate"/>
+        </w:r>
+        <w:r>
+          <w:rPr>
+            <w:noProof/>
+          </w:rPr>
+          <w:t>7</w:t>
+        </w:r>
+        <w:r>
+          <w:rPr>
+            <w:noProof/>
+          </w:rPr>
+          <w:fldChar w:fldCharType="end"/>
+        </w:r>
+      </w:hyperlink>
+    </w:p>
+    <w:p>
+      <w:pPr>
+        <w:pStyle w:val="TOC1"/>
+        <w:tabs>
+          <w:tab w:val="right" w:leader="dot" w:pos="9810"/>
+        </w:tabs>
         <w:rPr>
-          <w:rFonts w:ascii="Arial" w:hAnsi="Arial" w:eastAsia="Noto Sans JP"/>
-          <w:b/>
-          <w:color w:val="1F4E78"/>
-          <w:sz w:val="20"/>
+          <w:rFonts w:asciiTheme="minorHAnsi" w:eastAsiaTheme="minorEastAsia" w:hAnsiTheme="minorHAnsi"/>
+          <w:noProof/>
+          <w:kern w:val="2"/>
+          <w:sz w:val="21"/>
+          <w:szCs w:val="24"/>
+          <w:lang w:eastAsia="ja-JP"/>
+          <w14:ligatures w14:val="standardContextual"/>
         </w:rPr>
-        <w:t>13  ソース対応表</w:t>
-      </w:r>
+      </w:pPr>
+      <w:hyperlink w:anchor="_Toc238979297" w:history="1">
+        <w:r>
+          <w:rPr>
+            <w:rStyle w:val="aff"/>
+            <w:noProof/>
+          </w:rPr>
+          <w:t xml:space="preserve">8. </w:t>
+        </w:r>
+        <w:r>
+          <w:rPr>
+            <w:rStyle w:val="aff"/>
+            <w:noProof/>
+          </w:rPr>
+          <w:t>異常時・フォールバック仕様</w:t>
+        </w:r>
+        <w:r>
+          <w:rPr>
+            <w:noProof/>
+          </w:rPr>
+          <w:tab/>
+        </w:r>
+        <w:r>
+          <w:rPr>
+            <w:noProof/>
+          </w:rPr>
+          <w:fldChar w:fldCharType="begin"/>
+        </w:r>
+        <w:r>
+          <w:rPr>
+            <w:noProof/>
+          </w:rPr>
+          <w:instrText xml:space="preserve"> PAGEREF _Toc238979297 \h </w:instrText>
+        </w:r>
+        <w:r>
+          <w:rPr>
+            <w:noProof/>
+          </w:rPr>
+        </w:r>
+        <w:r>
+          <w:rPr>
+            <w:noProof/>
+          </w:rPr>
+          <w:fldChar w:fldCharType="separate"/>
+        </w:r>
+        <w:r>
+          <w:rPr>
+            <w:noProof/>
+          </w:rPr>
+          <w:t>7</w:t>
+        </w:r>
+        <w:r>
+          <w:rPr>
+            <w:noProof/>
+          </w:rPr>
+          <w:fldChar w:fldCharType="end"/>
+        </w:r>
+      </w:hyperlink>
+    </w:p>
+    <w:p>
+      <w:pPr>
+        <w:pStyle w:val="TOC1"/>
+        <w:tabs>
+          <w:tab w:val="right" w:leader="dot" w:pos="9810"/>
+        </w:tabs>
+        <w:rPr>
+          <w:rFonts w:asciiTheme="minorHAnsi" w:eastAsiaTheme="minorEastAsia" w:hAnsiTheme="minorHAnsi"/>
+          <w:noProof/>
+          <w:kern w:val="2"/>
+          <w:sz w:val="21"/>
+          <w:szCs w:val="24"/>
+          <w:lang w:eastAsia="ja-JP"/>
+          <w14:ligatures w14:val="standardContextual"/>
+        </w:rPr>
+      </w:pPr>
+      <w:hyperlink w:anchor="_Toc238979298" w:history="1">
+        <w:r>
+          <w:rPr>
+            <w:rStyle w:val="aff"/>
+            <w:noProof/>
+          </w:rPr>
+          <w:t xml:space="preserve">9. </w:t>
+        </w:r>
+        <w:r>
+          <w:rPr>
+            <w:rStyle w:val="aff"/>
+            <w:noProof/>
+          </w:rPr>
+          <w:t>設定・永続化仕様</w:t>
+        </w:r>
+        <w:r>
+          <w:rPr>
+            <w:noProof/>
+          </w:rPr>
+          <w:tab/>
+        </w:r>
+        <w:r>
+          <w:rPr>
+            <w:noProof/>
+          </w:rPr>
+          <w:fldChar w:fldCharType="begin"/>
+        </w:r>
+        <w:r>
+          <w:rPr>
+            <w:noProof/>
+          </w:rPr>
+          <w:instrText xml:space="preserve"> PAGEREF _Toc238979298 \h </w:instrText>
+        </w:r>
+        <w:r>
+          <w:rPr>
+            <w:noProof/>
+          </w:rPr>
+        </w:r>
+        <w:r>
+          <w:rPr>
+            <w:noProof/>
+          </w:rPr>
+          <w:fldChar w:fldCharType="separate"/>
+        </w:r>
+        <w:r>
+          <w:rPr>
+            <w:noProof/>
+          </w:rPr>
+          <w:t>8</w:t>
+        </w:r>
+        <w:r>
+          <w:rPr>
+            <w:noProof/>
+          </w:rPr>
+          <w:fldChar w:fldCharType="end"/>
+        </w:r>
+      </w:hyperlink>
+    </w:p>
+    <w:p>
+      <w:pPr>
+        <w:pStyle w:val="TOC2"/>
+        <w:tabs>
+          <w:tab w:val="right" w:leader="dot" w:pos="9810"/>
+        </w:tabs>
+        <w:rPr>
+          <w:rFonts w:asciiTheme="minorHAnsi" w:eastAsiaTheme="minorEastAsia" w:hAnsiTheme="minorHAnsi"/>
+          <w:noProof/>
+          <w:kern w:val="2"/>
+          <w:sz w:val="21"/>
+          <w:szCs w:val="24"/>
+          <w:lang w:eastAsia="ja-JP"/>
+          <w14:ligatures w14:val="standardContextual"/>
+        </w:rPr>
+      </w:pPr>
+      <w:hyperlink w:anchor="_Toc238979299" w:history="1">
+        <w:r>
+          <w:rPr>
+            <w:rStyle w:val="aff"/>
+            <w:noProof/>
+          </w:rPr>
+          <w:t xml:space="preserve">9.1 </w:t>
+        </w:r>
+        <w:r>
+          <w:rPr>
+            <w:rStyle w:val="aff"/>
+            <w:noProof/>
+          </w:rPr>
+          <w:t>主要設定</w:t>
+        </w:r>
+        <w:r>
+          <w:rPr>
+            <w:noProof/>
+          </w:rPr>
+          <w:tab/>
+        </w:r>
+        <w:r>
+          <w:rPr>
+            <w:noProof/>
+          </w:rPr>
+          <w:fldChar w:fldCharType="begin"/>
+        </w:r>
+        <w:r>
+          <w:rPr>
+            <w:noProof/>
+          </w:rPr>
+          <w:instrText xml:space="preserve"> PAGEREF _Toc238979299 \h </w:instrText>
+        </w:r>
+        <w:r>
+          <w:rPr>
+            <w:noProof/>
+          </w:rPr>
+        </w:r>
+        <w:r>
+          <w:rPr>
+            <w:noProof/>
+          </w:rPr>
+          <w:fldChar w:fldCharType="separate"/>
+        </w:r>
+        <w:r>
+          <w:rPr>
+            <w:noProof/>
+          </w:rPr>
+          <w:t>8</w:t>
+        </w:r>
+        <w:r>
+          <w:rPr>
+            <w:noProof/>
+          </w:rPr>
+          <w:fldChar w:fldCharType="end"/>
+        </w:r>
+      </w:hyperlink>
+    </w:p>
+    <w:p>
+      <w:pPr>
+        <w:pStyle w:val="TOC2"/>
+        <w:tabs>
+          <w:tab w:val="right" w:leader="dot" w:pos="9810"/>
+        </w:tabs>
+        <w:rPr>
+          <w:rFonts w:asciiTheme="minorHAnsi" w:eastAsiaTheme="minorEastAsia" w:hAnsiTheme="minorHAnsi"/>
+          <w:noProof/>
+          <w:kern w:val="2"/>
+          <w:sz w:val="21"/>
+          <w:szCs w:val="24"/>
+          <w:lang w:eastAsia="ja-JP"/>
+          <w14:ligatures w14:val="standardContextual"/>
+        </w:rPr>
+      </w:pPr>
+      <w:hyperlink w:anchor="_Toc238979300" w:history="1">
+        <w:r>
+          <w:rPr>
+            <w:rStyle w:val="aff"/>
+            <w:noProof/>
+          </w:rPr>
+          <w:t xml:space="preserve">9.2 </w:t>
+        </w:r>
+        <w:r>
+          <w:rPr>
+            <w:rStyle w:val="aff"/>
+            <w:noProof/>
+          </w:rPr>
+          <w:t>環境変数</w:t>
+        </w:r>
+        <w:r>
+          <w:rPr>
+            <w:noProof/>
+          </w:rPr>
+          <w:tab/>
+        </w:r>
+        <w:r>
+          <w:rPr>
+            <w:noProof/>
+          </w:rPr>
+          <w:fldChar w:fldCharType="begin"/>
+        </w:r>
+        <w:r>
+          <w:rPr>
+            <w:noProof/>
+          </w:rPr>
+          <w:instrText xml:space="preserve"> PAGEREF _Toc238979300 \h </w:instrText>
+        </w:r>
+        <w:r>
+          <w:rPr>
+            <w:noProof/>
+          </w:rPr>
+        </w:r>
+        <w:r>
+          <w:rPr>
+            <w:noProof/>
+          </w:rPr>
+          <w:fldChar w:fldCharType="separate"/>
+        </w:r>
+        <w:r>
+          <w:rPr>
+            <w:noProof/>
+          </w:rPr>
+          <w:t>8</w:t>
+        </w:r>
+        <w:r>
+          <w:rPr>
+            <w:noProof/>
+          </w:rPr>
+          <w:fldChar w:fldCharType="end"/>
+        </w:r>
+      </w:hyperlink>
+    </w:p>
+    <w:p>
+      <w:pPr>
+        <w:pStyle w:val="TOC1"/>
+        <w:tabs>
+          <w:tab w:val="right" w:leader="dot" w:pos="9810"/>
+        </w:tabs>
+        <w:rPr>
+          <w:rFonts w:asciiTheme="minorHAnsi" w:eastAsiaTheme="minorEastAsia" w:hAnsiTheme="minorHAnsi"/>
+          <w:noProof/>
+          <w:kern w:val="2"/>
+          <w:sz w:val="21"/>
+          <w:szCs w:val="24"/>
+          <w:lang w:eastAsia="ja-JP"/>
+          <w14:ligatures w14:val="standardContextual"/>
+        </w:rPr>
+      </w:pPr>
+      <w:hyperlink w:anchor="_Toc238979301" w:history="1">
+        <w:r>
+          <w:rPr>
+            <w:rStyle w:val="aff"/>
+            <w:noProof/>
+          </w:rPr>
+          <w:t xml:space="preserve">10. </w:t>
+        </w:r>
+        <w:r>
+          <w:rPr>
+            <w:rStyle w:val="aff"/>
+            <w:noProof/>
+          </w:rPr>
+          <w:t>非機能仕様</w:t>
+        </w:r>
+        <w:r>
+          <w:rPr>
+            <w:noProof/>
+          </w:rPr>
+          <w:tab/>
+        </w:r>
+        <w:r>
+          <w:rPr>
+            <w:noProof/>
+          </w:rPr>
+          <w:fldChar w:fldCharType="begin"/>
+        </w:r>
+        <w:r>
+          <w:rPr>
+            <w:noProof/>
+          </w:rPr>
+          <w:instrText xml:space="preserve"> PAGEREF _Toc238979301 \h </w:instrText>
+        </w:r>
+        <w:r>
+          <w:rPr>
+            <w:noProof/>
+          </w:rPr>
+        </w:r>
+        <w:r>
+          <w:rPr>
+            <w:noProof/>
+          </w:rPr>
+          <w:fldChar w:fldCharType="separate"/>
+        </w:r>
+        <w:r>
+          <w:rPr>
+            <w:noProof/>
+          </w:rPr>
+          <w:t>8</w:t>
+        </w:r>
+        <w:r>
+          <w:rPr>
+            <w:noProof/>
+          </w:rPr>
+          <w:fldChar w:fldCharType="end"/>
+        </w:r>
+      </w:hyperlink>
+    </w:p>
+    <w:p>
+      <w:pPr>
+        <w:pStyle w:val="TOC1"/>
+        <w:tabs>
+          <w:tab w:val="right" w:leader="dot" w:pos="9810"/>
+        </w:tabs>
+        <w:rPr>
+          <w:rFonts w:asciiTheme="minorHAnsi" w:eastAsiaTheme="minorEastAsia" w:hAnsiTheme="minorHAnsi"/>
+          <w:noProof/>
+          <w:kern w:val="2"/>
+          <w:sz w:val="21"/>
+          <w:szCs w:val="24"/>
+          <w:lang w:eastAsia="ja-JP"/>
+          <w14:ligatures w14:val="standardContextual"/>
+        </w:rPr>
+      </w:pPr>
+      <w:hyperlink w:anchor="_Toc238979302" w:history="1">
+        <w:r>
+          <w:rPr>
+            <w:rStyle w:val="aff"/>
+            <w:noProof/>
+          </w:rPr>
+          <w:t xml:space="preserve">11. </w:t>
+        </w:r>
+        <w:r>
+          <w:rPr>
+            <w:rStyle w:val="aff"/>
+            <w:noProof/>
+          </w:rPr>
+          <w:t>受入確認項目</w:t>
+        </w:r>
+        <w:r>
+          <w:rPr>
+            <w:noProof/>
+          </w:rPr>
+          <w:tab/>
+        </w:r>
+        <w:r>
+          <w:rPr>
+            <w:noProof/>
+          </w:rPr>
+          <w:fldChar w:fldCharType="begin"/>
+        </w:r>
+        <w:r>
+          <w:rPr>
+            <w:noProof/>
+          </w:rPr>
+          <w:instrText xml:space="preserve"> PAGEREF _Toc238979302 \h </w:instrText>
+        </w:r>
+        <w:r>
+          <w:rPr>
+            <w:noProof/>
+          </w:rPr>
+        </w:r>
+        <w:r>
+          <w:rPr>
+            <w:noProof/>
+          </w:rPr>
+          <w:fldChar w:fldCharType="separate"/>
+        </w:r>
+        <w:r>
+          <w:rPr>
+            <w:noProof/>
+          </w:rPr>
+          <w:t>9</w:t>
+        </w:r>
+        <w:r>
+          <w:rPr>
+            <w:noProof/>
+          </w:rPr>
+          <w:fldChar w:fldCharType="end"/>
+        </w:r>
+      </w:hyperlink>
+    </w:p>
+    <w:p>
+      <w:pPr>
+        <w:pStyle w:val="TOC1"/>
+        <w:tabs>
+          <w:tab w:val="right" w:leader="dot" w:pos="9810"/>
+        </w:tabs>
+        <w:rPr>
+          <w:rFonts w:asciiTheme="minorHAnsi" w:eastAsiaTheme="minorEastAsia" w:hAnsiTheme="minorHAnsi"/>
+          <w:noProof/>
+          <w:kern w:val="2"/>
+          <w:sz w:val="21"/>
+          <w:szCs w:val="24"/>
+          <w:lang w:eastAsia="ja-JP"/>
+          <w14:ligatures w14:val="standardContextual"/>
+        </w:rPr>
+      </w:pPr>
+      <w:hyperlink w:anchor="_Toc238979303" w:history="1">
+        <w:r>
+          <w:rPr>
+            <w:rStyle w:val="aff"/>
+            <w:noProof/>
+          </w:rPr>
+          <w:t xml:space="preserve">12. </w:t>
+        </w:r>
+        <w:r>
+          <w:rPr>
+            <w:rStyle w:val="aff"/>
+            <w:noProof/>
+          </w:rPr>
+          <w:t>既知の制約</w:t>
+        </w:r>
+        <w:r>
+          <w:rPr>
+            <w:noProof/>
+          </w:rPr>
+          <w:tab/>
+        </w:r>
+        <w:r>
+          <w:rPr>
+            <w:noProof/>
+          </w:rPr>
+          <w:fldChar w:fldCharType="begin"/>
+        </w:r>
+        <w:r>
+          <w:rPr>
+            <w:noProof/>
+          </w:rPr>
+          <w:instrText xml:space="preserve"> PAGEREF _Toc238979303 \h </w:instrText>
+        </w:r>
+        <w:r>
+          <w:rPr>
+            <w:noProof/>
+          </w:rPr>
+        </w:r>
+        <w:r>
+          <w:rPr>
+            <w:noProof/>
+          </w:rPr>
+          <w:fldChar w:fldCharType="separate"/>
+        </w:r>
+        <w:r>
+          <w:rPr>
+            <w:noProof/>
+          </w:rPr>
+          <w:t>9</w:t>
+        </w:r>
+        <w:r>
+          <w:rPr>
+            <w:noProof/>
+          </w:rPr>
+          <w:fldChar w:fldCharType="end"/>
+        </w:r>
+      </w:hyperlink>
+    </w:p>
+    <w:p>
+      <w:pPr>
+        <w:pStyle w:val="TOC1"/>
+        <w:tabs>
+          <w:tab w:val="right" w:leader="dot" w:pos="9810"/>
+        </w:tabs>
+        <w:rPr>
+          <w:rFonts w:asciiTheme="minorHAnsi" w:eastAsiaTheme="minorEastAsia" w:hAnsiTheme="minorHAnsi"/>
+          <w:noProof/>
+          <w:kern w:val="2"/>
+          <w:sz w:val="21"/>
+          <w:szCs w:val="24"/>
+          <w:lang w:eastAsia="ja-JP"/>
+          <w14:ligatures w14:val="standardContextual"/>
+        </w:rPr>
+      </w:pPr>
+      <w:hyperlink w:anchor="_Toc238979304" w:history="1">
+        <w:r>
+          <w:rPr>
+            <w:rStyle w:val="aff"/>
+            <w:noProof/>
+          </w:rPr>
+          <w:t xml:space="preserve">13. </w:t>
+        </w:r>
+        <w:r>
+          <w:rPr>
+            <w:rStyle w:val="aff"/>
+            <w:noProof/>
+          </w:rPr>
+          <w:t>ソース対応表</w:t>
+        </w:r>
+        <w:r>
+          <w:rPr>
+            <w:noProof/>
+          </w:rPr>
+          <w:tab/>
+        </w:r>
+        <w:r>
+          <w:rPr>
+            <w:noProof/>
+          </w:rPr>
+          <w:fldChar w:fldCharType="begin"/>
+        </w:r>
+        <w:r>
+          <w:rPr>
+            <w:noProof/>
+          </w:rPr>
+          <w:instrText xml:space="preserve"> PAGEREF _Toc238979304 \h </w:instrText>
+        </w:r>
+        <w:r>
+          <w:rPr>
+            <w:noProof/>
+          </w:rPr>
+        </w:r>
+        <w:r>
+          <w:rPr>
+            <w:noProof/>
+          </w:rPr>
+          <w:fldChar w:fldCharType="separate"/>
+        </w:r>
+        <w:r>
+          <w:rPr>
+            <w:noProof/>
+          </w:rPr>
+          <w:t>10</w:t>
+        </w:r>
+        <w:r>
+          <w:rPr>
+            <w:noProof/>
+          </w:rPr>
+          <w:fldChar w:fldCharType="end"/>
+        </w:r>
+      </w:hyperlink>
     </w:p>
     <w:p>
       <w:r>
-        <w:br w:type="page"/>
+        <w:fldChar w:fldCharType="end"/>
       </w:r>
     </w:p>
     <w:p>
       <w:pPr>
         <w:pStyle w:val="Heading1"/>
         <w:keepNext/>
+        <w:pageBreakBefore/>
       </w:pPr>
+      <w:bookmarkStart w:id="1" w:name="_Toc238979284"/>
       <w:r>
         <w:t>1. 文書概要</w:t>
       </w:r>
+      <w:bookmarkEnd w:id="1"/>
     </w:p>
     <w:p>
       <w:pPr>
         <w:pStyle w:val="Heading2"/>
         <w:keepNext/>
       </w:pPr>
+      <w:bookmarkStart w:id="2" w:name="_Toc238979285"/>
       <w:r>
         <w:t>1.1 目的</w:t>
       </w:r>
+      <w:bookmarkEnd w:id="2"/>
     </w:p>
     <w:p>
       <w:r>
@@ -580,9 +1967,11 @@
         <w:pStyle w:val="Heading2"/>
         <w:keepNext/>
       </w:pPr>
+      <w:bookmarkStart w:id="3" w:name="_Toc238979286"/>
       <w:r>
         <w:t>1.2 対象範囲</w:t>
       </w:r>
+      <w:bookmarkEnd w:id="3"/>
     </w:p>
     <w:p>
       <w:pPr>
@@ -696,10 +2085,13 @@
       <w:pPr>
         <w:pStyle w:val="Heading1"/>
         <w:keepNext/>
+        <w:pageBreakBefore/>
       </w:pPr>
+      <w:bookmarkStart w:id="4" w:name="_Toc238979287"/>
       <w:r>
         <w:t>2. システム概要</w:t>
       </w:r>
+      <w:bookmarkEnd w:id="4"/>
     </w:p>
     <w:p>
       <w:r>
@@ -1052,10 +2444,13 @@
       <w:pPr>
         <w:pStyle w:val="Heading1"/>
         <w:keepNext/>
+        <w:pageBreakBefore/>
       </w:pPr>
+      <w:bookmarkStart w:id="5" w:name="_Toc238979288"/>
       <w:r>
         <w:t>3. 動作環境</w:t>
       </w:r>
+      <w:bookmarkEnd w:id="5"/>
     </w:p>
     <w:tbl>
       <w:tblPr>
@@ -1497,10 +2892,13 @@
       <w:pPr>
         <w:pStyle w:val="Heading1"/>
         <w:keepNext/>
+        <w:pageBreakBefore/>
       </w:pPr>
+      <w:bookmarkStart w:id="6" w:name="_Toc238979289"/>
       <w:r>
         <w:t>4. 機能仕様</w:t>
       </w:r>
+      <w:bookmarkEnd w:id="6"/>
     </w:p>
     <w:tbl>
       <w:tblPr>
@@ -2722,19 +4120,24 @@
       <w:pPr>
         <w:pStyle w:val="Heading1"/>
         <w:keepNext/>
+        <w:pageBreakBefore/>
       </w:pPr>
+      <w:bookmarkStart w:id="7" w:name="_Toc238979290"/>
       <w:r>
         <w:t>5. 画面・操作仕様</w:t>
       </w:r>
+      <w:bookmarkEnd w:id="7"/>
     </w:p>
     <w:p>
       <w:pPr>
         <w:pStyle w:val="Heading2"/>
         <w:keepNext/>
       </w:pPr>
+      <w:bookmarkStart w:id="8" w:name="_Toc238979291"/>
       <w:r>
         <w:t>5.1 通常画面構成</w:t>
       </w:r>
+      <w:bookmarkEnd w:id="8"/>
     </w:p>
     <w:tbl>
       <w:tblPr>
@@ -3303,9 +4706,11 @@
         <w:pStyle w:val="Heading2"/>
         <w:keepNext/>
       </w:pPr>
+      <w:bookmarkStart w:id="9" w:name="_Toc238979292"/>
       <w:r>
         <w:t>5.2 タッチ判定</w:t>
       </w:r>
+      <w:bookmarkEnd w:id="9"/>
     </w:p>
     <w:p>
       <w:r>
@@ -3321,9 +4726,11 @@
         <w:pStyle w:val="Heading2"/>
         <w:keepNext/>
       </w:pPr>
+      <w:bookmarkStart w:id="10" w:name="_Toc238979293"/>
       <w:r>
         <w:t>5.3 レイアウト安定性</w:t>
       </w:r>
+      <w:bookmarkEnd w:id="10"/>
     </w:p>
     <w:p>
       <w:pPr>
@@ -3393,10 +4800,13 @@
       <w:pPr>
         <w:pStyle w:val="Heading1"/>
         <w:keepNext/>
+        <w:pageBreakBefore/>
       </w:pPr>
+      <w:bookmarkStart w:id="11" w:name="_Toc238979294"/>
       <w:r>
         <w:t>6. データ取得・表示仕様</w:t>
       </w:r>
+      <w:bookmarkEnd w:id="11"/>
     </w:p>
     <w:tbl>
       <w:tblPr>
@@ -4660,9 +6070,11 @@
         <w:pStyle w:val="Heading2"/>
         <w:keepNext/>
       </w:pPr>
+      <w:bookmarkStart w:id="12" w:name="_Toc238979295"/>
       <w:r>
         <w:t>6.1 情報源選択</w:t>
       </w:r>
+      <w:bookmarkEnd w:id="12"/>
     </w:p>
     <w:tbl>
       <w:tblPr>
@@ -5079,10 +6491,13 @@
       <w:pPr>
         <w:pStyle w:val="Heading1"/>
         <w:keepNext/>
+        <w:pageBreakBefore/>
       </w:pPr>
+      <w:bookmarkStart w:id="13" w:name="_Toc238979296"/>
       <w:r>
         <w:t>7. 表示形式・単位</w:t>
       </w:r>
+      <w:bookmarkEnd w:id="13"/>
     </w:p>
     <w:tbl>
       <w:tblPr>
@@ -5781,10 +7196,13 @@
       <w:pPr>
         <w:pStyle w:val="Heading1"/>
         <w:keepNext/>
+        <w:pageBreakBefore/>
       </w:pPr>
+      <w:bookmarkStart w:id="14" w:name="_Toc238979297"/>
       <w:r>
         <w:t>8. 異常時・フォールバック仕様</w:t>
       </w:r>
+      <w:bookmarkEnd w:id="14"/>
     </w:p>
     <w:tbl>
       <w:tblPr>
@@ -6278,19 +7696,24 @@
       <w:pPr>
         <w:pStyle w:val="Heading1"/>
         <w:keepNext/>
+        <w:pageBreakBefore/>
       </w:pPr>
+      <w:bookmarkStart w:id="15" w:name="_Toc238979298"/>
       <w:r>
         <w:t>9. 設定・永続化仕様</w:t>
       </w:r>
+      <w:bookmarkEnd w:id="15"/>
     </w:p>
     <w:p>
       <w:pPr>
         <w:pStyle w:val="Heading2"/>
         <w:keepNext/>
       </w:pPr>
+      <w:bookmarkStart w:id="16" w:name="_Toc238979299"/>
       <w:r>
         <w:t>9.1 主要設定</w:t>
       </w:r>
+      <w:bookmarkEnd w:id="16"/>
     </w:p>
     <w:tbl>
       <w:tblPr>
@@ -6920,9 +8343,11 @@
         <w:pStyle w:val="Heading2"/>
         <w:keepNext/>
       </w:pPr>
+      <w:bookmarkStart w:id="17" w:name="_Toc238979300"/>
       <w:r>
         <w:t>9.2 環境変数</w:t>
       </w:r>
+      <w:bookmarkEnd w:id="17"/>
     </w:p>
     <w:tbl>
       <w:tblPr>
@@ -7641,10 +9066,13 @@
       <w:pPr>
         <w:pStyle w:val="Heading1"/>
         <w:keepNext/>
+        <w:pageBreakBefore/>
       </w:pPr>
+      <w:bookmarkStart w:id="18" w:name="_Toc238979301"/>
       <w:r>
         <w:t>10. 非機能仕様</w:t>
       </w:r>
+      <w:bookmarkEnd w:id="18"/>
     </w:p>
     <w:p>
       <w:pPr>
@@ -7762,10 +9190,13 @@
       <w:pPr>
         <w:pStyle w:val="Heading1"/>
         <w:keepNext/>
+        <w:pageBreakBefore/>
       </w:pPr>
+      <w:bookmarkStart w:id="19" w:name="_Toc238979302"/>
       <w:r>
         <w:t>11. 受入確認項目</w:t>
       </w:r>
+      <w:bookmarkEnd w:id="19"/>
     </w:p>
     <w:tbl>
       <w:tblPr>
@@ -8652,10 +10083,13 @@
       <w:pPr>
         <w:pStyle w:val="Heading1"/>
         <w:keepNext/>
+        <w:pageBreakBefore/>
       </w:pPr>
+      <w:bookmarkStart w:id="20" w:name="_Toc238979303"/>
       <w:r>
         <w:t>12. 既知の制約</w:t>
       </w:r>
+      <w:bookmarkEnd w:id="20"/>
     </w:p>
     <w:p>
       <w:pPr>
@@ -8757,10 +10191,13 @@
       <w:pPr>
         <w:pStyle w:val="Heading1"/>
         <w:keepNext/>
+        <w:pageBreakBefore/>
       </w:pPr>
+      <w:bookmarkStart w:id="21" w:name="_Toc238979304"/>
       <w:r>
         <w:t>13. ソース対応表</w:t>
       </w:r>
+      <w:bookmarkEnd w:id="21"/>
     </w:p>
     <w:tbl>
       <w:tblPr>
@@ -21561,6 +22998,14 @@
       <w:sz w:val="17"/>
     </w:rPr>
   </w:style>
+  <w:style w:type="paragraph" w:customStyle="1" w:styleId="TOC1">
+    <w:name w:val="TOC 1"/>
+    <w:basedOn w:val="Normal"/>
+  </w:style>
+  <w:style w:type="paragraph" w:customStyle="1" w:styleId="TOC2">
+    <w:name w:val="TOC 2"/>
+    <w:basedOn w:val="Normal"/>
+  </w:style>
 </w:styles>
 </file>
 

</xml_diff>

<commit_message>
docs: align v2.4.0 documentation with current source
</commit_message>
<xml_diff>
--- a/documents/DeskSideClock_ソフトウェア仕様書_v2.4.0.docx
+++ b/documents/DeskSideClock_ソフトウェア仕様書_v2.4.0.docx
@@ -6224,7 +6224,7 @@
                 <w:rFonts w:ascii="Arial" w:hAnsi="Arial" w:eastAsia="Noto Sans JP"/>
                 <w:sz w:val="17"/>
               </w:rPr>
-              <w:t>SHT20 → SWITCHBOT → BME280</w:t>
+              <w:t>SHT20 → AHT21 → SWITCHBOT → BME280</w:t>
             </w:r>
           </w:p>
         </w:tc>
@@ -10104,7 +10104,7 @@
           <w:rFonts w:ascii="Arial" w:hAnsi="Arial" w:eastAsia="Noto Sans JP"/>
           <w:sz w:val="20"/>
         </w:rPr>
-        <w:t>バージョン状態は development。画面分割リファクタリングの互換コードと一部重複定義が app/clock.py に残る。</w:t>
+        <w:t>バージョン状態は v2.4.0（release）。画面分割リファクタリングの互換コードと一部重複定義が app/clock.py に残る。</w:t>
       </w:r>
     </w:p>
     <w:p>
@@ -10120,7 +10120,7 @@
           <w:rFonts w:ascii="Arial" w:hAnsi="Arial" w:eastAsia="Noto Sans JP"/>
           <w:sz w:val="20"/>
         </w:rPr>
-        <w:t>AHT21はワーカー登録されるが、現行INDOOR_SOURCESには含まれず、通常のタップ巡回では選択されない。</w:t>
+        <w:t>室温のタップ巡回はSHT20、AHT21、SwitchBot、BME280の順で行い、無効・未取得・期限切れの候補を飛ばす。</w:t>
       </w:r>
     </w:p>
     <w:p>

</xml_diff>